<commit_message>
feat: hoàn thiện cấu trúc entities, repositories, dto record và global exception handler
</commit_message>
<xml_diff>
--- a/StudentManagement.docx
+++ b/StudentManagement.docx
@@ -4,7 +4,27 @@
   <w:body>
     <w:p>
       <w:r>
-        <w:t>## 1. Công nghệ Sử dụng (Tech Stack) - **Ngôn ngữ:** Java 21 - **Framework chính:** Spring Boot 3.x - **Tầng dữ liệu (Database):** MySQL + Spring Data JPA (Hibernate) - **Bảo mật &amp; Phân quyền:** Spring Security + JWT (JSON Web Token) - **Kiểm tra dữ liệu:** Spring Boot Starter Validation - **Công cụ tối ưu code:** Lombok - **Ánh xạ dữ liệu:** MapStruct (Entity &lt;-&gt; DTO) - **Công cụ hỗ trợ phát triển:** Postman (Test API), Docker (Đóng gói &amp; Triển khai)</w:t>
+        <w:t>## 1. Công nghệ Sử dụng (Tech Stack)</w:t>
+      </w:r>
+    </w:p>
+    <w:p>
+      <w:r>
+        <w:t xml:space="preserve"> - **Ngôn ngữ:** Java 21</w:t>
+      </w:r>
+    </w:p>
+    <w:p>
+      <w:r>
+        <w:t xml:space="preserve"> - **Framework chính:** Spring Boot 3.x </w:t>
+      </w:r>
+    </w:p>
+    <w:p>
+      <w:r>
+        <w:t>- **Tầng dữ liệu (Database):** MySQL + Spring Data JPA (Hibernate)</w:t>
+      </w:r>
+    </w:p>
+    <w:p>
+      <w:r>
+        <w:t xml:space="preserve"> - **Bảo mật &amp; Phân quyền:** Spring Security + JWT (JSON Web Token) - **Kiểm tra dữ liệu:** Spring Boot Starter Validation - **Công cụ tối ưu code:** Lombok - **Ánh xạ dữ liệu:** MapStruct (Entity &lt;-&gt; DTO) - **Công cụ hỗ trợ phát triển:** Postman (Test API), Docker (Đóng gói &amp; Triển khai)</w:t>
       </w:r>
     </w:p>
     <w:p/>
@@ -338,6 +358,7 @@
           <w:b/>
           <w:bCs/>
         </w:rPr>
+        <w:lastRenderedPageBreak/>
         <w:t>CourseClass (Lớp học phần):</w:t>
       </w:r>
       <w:r>
@@ -366,7 +387,6 @@
           <w:b/>
           <w:bCs/>
         </w:rPr>
-        <w:lastRenderedPageBreak/>
         <w:t>Grade (Điểm số):</w:t>
       </w:r>
       <w:r>
@@ -623,6 +643,7 @@
         </w:numPr>
       </w:pPr>
       <w:r>
+        <w:lastRenderedPageBreak/>
         <w:t>Định nghĩa các RESTful API endpoints an toàn, rõ ràng.</w:t>
       </w:r>
     </w:p>
@@ -645,7 +666,6 @@
         </w:numPr>
       </w:pPr>
       <w:r>
-        <w:lastRenderedPageBreak/>
         <w:t xml:space="preserve">Sử dụng </w:t>
       </w:r>
       <w:r>
@@ -731,6 +751,405 @@
       </w:pPr>
       <w:r>
         <w:t>Viết file docker-compose.yml để liên kết đồng bộ Container Spring Boot và Container MySQL. """</w:t>
+      </w:r>
+    </w:p>
+    <w:p>
+      <w:r>
+        <w:t>Đã làm được :</w:t>
+      </w:r>
+    </w:p>
+    <w:p>
+      <w:pPr>
+        <w:rPr>
+          <w:b/>
+          <w:bCs/>
+        </w:rPr>
+      </w:pPr>
+      <w:r>
+        <w:rPr>
+          <w:b/>
+          <w:bCs/>
+        </w:rPr>
+        <w:t>1. Khởi tạo &amp; Cấu hình Hệ thống nền tảng</w:t>
+      </w:r>
+    </w:p>
+    <w:p>
+      <w:pPr>
+        <w:numPr>
+          <w:ilvl w:val="0"/>
+          <w:numId w:val="9"/>
+        </w:numPr>
+      </w:pPr>
+      <w:r>
+        <w:rPr>
+          <w:b/>
+          <w:bCs/>
+        </w:rPr>
+        <w:t>Đồng bộ cấu hình hiện đại:</w:t>
+      </w:r>
+      <w:r>
+        <w:t xml:space="preserve"> Xác định hệ thống chạy trên nền tảng cực kỳ mới là </w:t>
+      </w:r>
+      <w:r>
+        <w:rPr>
+          <w:b/>
+          <w:bCs/>
+        </w:rPr>
+        <w:t>Java 26</w:t>
+      </w:r>
+      <w:r>
+        <w:t xml:space="preserve"> và </w:t>
+      </w:r>
+      <w:r>
+        <w:rPr>
+          <w:b/>
+          <w:bCs/>
+        </w:rPr>
+        <w:t>Spring Boot 4.0.6</w:t>
+      </w:r>
+      <w:r>
+        <w:t>.</w:t>
+      </w:r>
+    </w:p>
+    <w:p>
+      <w:pPr>
+        <w:numPr>
+          <w:ilvl w:val="0"/>
+          <w:numId w:val="9"/>
+        </w:numPr>
+      </w:pPr>
+      <w:r>
+        <w:rPr>
+          <w:b/>
+          <w:bCs/>
+        </w:rPr>
+        <w:t>Kết nối Database thành công:</w:t>
+      </w:r>
+      <w:r>
+        <w:t xml:space="preserve"> Khởi tạo cơ sở dữ liệu student_management trên </w:t>
+      </w:r>
+      <w:r>
+        <w:rPr>
+          <w:b/>
+          <w:bCs/>
+        </w:rPr>
+        <w:t>MySQL Workbench</w:t>
+      </w:r>
+      <w:r>
+        <w:t>.</w:t>
+      </w:r>
+    </w:p>
+    <w:p>
+      <w:pPr>
+        <w:numPr>
+          <w:ilvl w:val="0"/>
+          <w:numId w:val="9"/>
+        </w:numPr>
+      </w:pPr>
+      <w:r>
+        <w:rPr>
+          <w:b/>
+          <w:bCs/>
+        </w:rPr>
+        <w:t>Tối ưu hóa cấu hình YAML:</w:t>
+      </w:r>
+      <w:r>
+        <w:t xml:space="preserve"> Thiết lập file application.yaml kết nối mượt mà tới MySQL, xử lý triệt để lỗi bảo mật JDBC bằng tham số cấu hình nâng cao allowPublicKeyRetrieval=true.</w:t>
+      </w:r>
+    </w:p>
+    <w:p>
+      <w:pPr>
+        <w:numPr>
+          <w:ilvl w:val="0"/>
+          <w:numId w:val="9"/>
+        </w:numPr>
+      </w:pPr>
+      <w:r>
+        <w:rPr>
+          <w:b/>
+          <w:bCs/>
+        </w:rPr>
+        <w:t>Kiểm thử Server (Run test):</w:t>
+      </w:r>
+      <w:r>
+        <w:t xml:space="preserve"> Ứng dụng đã được chạy thử, khởi động thành công 100% trên cổng 8080 mà không gặp bất kỳ lỗi xung đột thư viện nào.</w:t>
+      </w:r>
+    </w:p>
+    <w:p>
+      <w:pPr>
+        <w:rPr>
+          <w:b/>
+          <w:bCs/>
+        </w:rPr>
+      </w:pPr>
+      <w:r>
+        <w:rPr>
+          <w:b/>
+          <w:bCs/>
+        </w:rPr>
+        <w:t>2. Quản lý mã nguồn chuẩn doanh nghiệp (Git Flow)</w:t>
+      </w:r>
+    </w:p>
+    <w:p>
+      <w:pPr>
+        <w:numPr>
+          <w:ilvl w:val="0"/>
+          <w:numId w:val="10"/>
+        </w:numPr>
+      </w:pPr>
+      <w:r>
+        <w:rPr>
+          <w:b/>
+          <w:bCs/>
+        </w:rPr>
+        <w:t>Khởi tạo Git:</w:t>
+      </w:r>
+      <w:r>
+        <w:t xml:space="preserve"> Chạy thành công git init, gom toàn bộ file cấu hình ban đầu vào vùng chờ và tạo bản commit gốc (Init project).</w:t>
+      </w:r>
+    </w:p>
+    <w:p>
+      <w:pPr>
+        <w:numPr>
+          <w:ilvl w:val="0"/>
+          <w:numId w:val="10"/>
+        </w:numPr>
+      </w:pPr>
+      <w:r>
+        <w:rPr>
+          <w:b/>
+          <w:bCs/>
+        </w:rPr>
+        <w:t>Chiến lược chia nhánh an toàn:</w:t>
+      </w:r>
+      <w:r>
+        <w:t xml:space="preserve"> Tạo và chuyển thành công sang nhánh làm việc độc lập </w:t>
+      </w:r>
+      <w:r>
+        <w:rPr>
+          <w:b/>
+          <w:bCs/>
+        </w:rPr>
+        <w:t>feature/setup-entities</w:t>
+      </w:r>
+      <w:r>
+        <w:t>. Toàn bộ code bạn đang viết được lưu trữ cách ly hoàn toàn tại đây, giúp nhánh chính main luôn ở trạng thái sạch và chạy ổn định.</w:t>
+      </w:r>
+    </w:p>
+    <w:p>
+      <w:pPr>
+        <w:rPr>
+          <w:b/>
+          <w:bCs/>
+        </w:rPr>
+      </w:pPr>
+      <w:r>
+        <w:rPr>
+          <w:b/>
+          <w:bCs/>
+        </w:rPr>
+        <w:t>3. Thiết lập Kiến trúc Tự động hóa Dữ liệu</w:t>
+      </w:r>
+    </w:p>
+    <w:p>
+      <w:pPr>
+        <w:numPr>
+          <w:ilvl w:val="0"/>
+          <w:numId w:val="11"/>
+        </w:numPr>
+      </w:pPr>
+      <w:r>
+        <w:rPr>
+          <w:b/>
+          <w:bCs/>
+        </w:rPr>
+        <w:lastRenderedPageBreak/>
+        <w:t>Tạo BaseEntity:</w:t>
+      </w:r>
+      <w:r>
+        <w:t xml:space="preserve"> Thiết kế lớp cha trừu tượng giúp tất cả các bảng sau này tự động sở hữu và quản lý hai cột mốc thời gian: created_at (thời gian tạo) và updated_at (thời gian cập nhật).</w:t>
+      </w:r>
+    </w:p>
+    <w:p>
+      <w:pPr>
+        <w:numPr>
+          <w:ilvl w:val="0"/>
+          <w:numId w:val="11"/>
+        </w:numPr>
+      </w:pPr>
+      <w:r>
+        <w:rPr>
+          <w:b/>
+          <w:bCs/>
+        </w:rPr>
+        <w:t>Kích hoạt JPA Auditing:</w:t>
+      </w:r>
+      <w:r>
+        <w:t xml:space="preserve"> Thêm annotation @EnableJpaAuditing vào file chạy chính của hệ thống để kích hoạt cơ chế tự động điền thời gian của Spring Data JPA.</w:t>
+      </w:r>
+    </w:p>
+    <w:p>
+      <w:pPr>
+        <w:rPr>
+          <w:b/>
+          <w:bCs/>
+        </w:rPr>
+      </w:pPr>
+      <w:r>
+        <w:rPr>
+          <w:b/>
+          <w:bCs/>
+        </w:rPr>
+        <w:t>4. Hoàn thành mô hình thực thể cốt lõi (5 JPA Entities)</w:t>
+      </w:r>
+    </w:p>
+    <w:p>
+      <w:r>
+        <w:t>Bạn đã hoàn thành việc thiết kế và viết mã nguồn cho toàn bộ các thực thể cốt lõi của hệ thống bao gồm:</w:t>
+      </w:r>
+    </w:p>
+    <w:p>
+      <w:pPr>
+        <w:numPr>
+          <w:ilvl w:val="0"/>
+          <w:numId w:val="12"/>
+        </w:numPr>
+      </w:pPr>
+      <w:r>
+        <w:rPr>
+          <w:b/>
+          <w:bCs/>
+        </w:rPr>
+        <w:t>Role</w:t>
+      </w:r>
+      <w:r>
+        <w:t>: Quản lý các vai trò trong hệ thống (ADMIN, TEACHER, STUDENT).</w:t>
+      </w:r>
+    </w:p>
+    <w:p>
+      <w:pPr>
+        <w:numPr>
+          <w:ilvl w:val="0"/>
+          <w:numId w:val="12"/>
+        </w:numPr>
+      </w:pPr>
+      <w:r>
+        <w:rPr>
+          <w:b/>
+          <w:bCs/>
+        </w:rPr>
+        <w:t>User</w:t>
+      </w:r>
+      <w:r>
+        <w:t>: Quản lý tài khoản đăng nhập, email, mật khẩu của người dùng.</w:t>
+      </w:r>
+    </w:p>
+    <w:p>
+      <w:pPr>
+        <w:numPr>
+          <w:ilvl w:val="1"/>
+          <w:numId w:val="12"/>
+        </w:numPr>
+      </w:pPr>
+      <w:r>
+        <w:rPr>
+          <w:i/>
+          <w:iCs/>
+        </w:rPr>
+        <w:t>Mối quan hệ:</w:t>
+      </w:r>
+      <w:r>
+        <w:t xml:space="preserve"> Thiết lập quan hệ nhiều - nhiều (@ManyToMany) giữa User và Role, hệ thống sẽ tự sinh bảng trung gian user_roles.</w:t>
+      </w:r>
+    </w:p>
+    <w:p>
+      <w:pPr>
+        <w:numPr>
+          <w:ilvl w:val="0"/>
+          <w:numId w:val="12"/>
+        </w:numPr>
+      </w:pPr>
+      <w:r>
+        <w:rPr>
+          <w:b/>
+          <w:bCs/>
+        </w:rPr>
+        <w:t>Department</w:t>
+      </w:r>
+      <w:r>
+        <w:t>: Quản lý thông tin các Khoa/Viện đào tạo (Mã khoa, tên khoa).</w:t>
+      </w:r>
+    </w:p>
+    <w:p>
+      <w:pPr>
+        <w:numPr>
+          <w:ilvl w:val="0"/>
+          <w:numId w:val="12"/>
+        </w:numPr>
+      </w:pPr>
+      <w:r>
+        <w:rPr>
+          <w:b/>
+          <w:bCs/>
+        </w:rPr>
+        <w:t>Class</w:t>
+      </w:r>
+      <w:r>
+        <w:t>: Quản lý các Lớp hành chính của trường.</w:t>
+      </w:r>
+    </w:p>
+    <w:p>
+      <w:pPr>
+        <w:numPr>
+          <w:ilvl w:val="1"/>
+          <w:numId w:val="12"/>
+        </w:numPr>
+      </w:pPr>
+      <w:r>
+        <w:rPr>
+          <w:i/>
+          <w:iCs/>
+        </w:rPr>
+        <w:t>Mối quan hệ:</w:t>
+      </w:r>
+      <w:r>
+        <w:t xml:space="preserve"> Thiết lập quan hệ nhiều lớp thuộc về một khoa (@ManyToOne tới Department).</w:t>
+      </w:r>
+    </w:p>
+    <w:p>
+      <w:pPr>
+        <w:numPr>
+          <w:ilvl w:val="0"/>
+          <w:numId w:val="12"/>
+        </w:numPr>
+      </w:pPr>
+      <w:r>
+        <w:rPr>
+          <w:b/>
+          <w:bCs/>
+        </w:rPr>
+        <w:t>Student</w:t>
+      </w:r>
+      <w:r>
+        <w:t>: Thực thể trung tâm quản lý hồ sơ sinh viên.</w:t>
+      </w:r>
+    </w:p>
+    <w:p>
+      <w:pPr>
+        <w:numPr>
+          <w:ilvl w:val="1"/>
+          <w:numId w:val="12"/>
+        </w:numPr>
+      </w:pPr>
+      <w:r>
+        <w:rPr>
+          <w:i/>
+          <w:iCs/>
+        </w:rPr>
+        <w:t>Mối quan hệ:</w:t>
+      </w:r>
+      <w:r>
+        <w:t xml:space="preserve"> Mỗi sinh viên gắn liền với 1 tài khoản hệ thống (@OneToOne tới User) và thuộc về 1 lớp hành chính cố định (@ManyToOne tới Class).</w:t>
       </w:r>
     </w:p>
     <w:p/>
@@ -896,6 +1315,155 @@
     </w:lvl>
   </w:abstractNum>
   <w:abstractNum w:abstractNumId="1" w15:restartNumberingAfterBreak="0">
+    <w:nsid w:val="127416A2"/>
+    <w:multiLevelType w:val="multilevel"/>
+    <w:tmpl w:val="E29861CA"/>
+    <w:lvl w:ilvl="0">
+      <w:start w:val="1"/>
+      <w:numFmt w:val="bullet"/>
+      <w:lvlText w:val=""/>
+      <w:lvlJc w:val="left"/>
+      <w:pPr>
+        <w:tabs>
+          <w:tab w:val="num" w:pos="720"/>
+        </w:tabs>
+        <w:ind w:left="720" w:hanging="360"/>
+      </w:pPr>
+      <w:rPr>
+        <w:rFonts w:ascii="Symbol" w:hAnsi="Symbol" w:hint="default"/>
+        <w:sz w:val="20"/>
+      </w:rPr>
+    </w:lvl>
+    <w:lvl w:ilvl="1" w:tentative="1">
+      <w:start w:val="1"/>
+      <w:numFmt w:val="bullet"/>
+      <w:lvlText w:val="o"/>
+      <w:lvlJc w:val="left"/>
+      <w:pPr>
+        <w:tabs>
+          <w:tab w:val="num" w:pos="1440"/>
+        </w:tabs>
+        <w:ind w:left="1440" w:hanging="360"/>
+      </w:pPr>
+      <w:rPr>
+        <w:rFonts w:ascii="Courier New" w:hAnsi="Courier New" w:hint="default"/>
+        <w:sz w:val="20"/>
+      </w:rPr>
+    </w:lvl>
+    <w:lvl w:ilvl="2" w:tentative="1">
+      <w:start w:val="1"/>
+      <w:numFmt w:val="bullet"/>
+      <w:lvlText w:val=""/>
+      <w:lvlJc w:val="left"/>
+      <w:pPr>
+        <w:tabs>
+          <w:tab w:val="num" w:pos="2160"/>
+        </w:tabs>
+        <w:ind w:left="2160" w:hanging="360"/>
+      </w:pPr>
+      <w:rPr>
+        <w:rFonts w:ascii="Wingdings" w:hAnsi="Wingdings" w:hint="default"/>
+        <w:sz w:val="20"/>
+      </w:rPr>
+    </w:lvl>
+    <w:lvl w:ilvl="3" w:tentative="1">
+      <w:start w:val="1"/>
+      <w:numFmt w:val="bullet"/>
+      <w:lvlText w:val=""/>
+      <w:lvlJc w:val="left"/>
+      <w:pPr>
+        <w:tabs>
+          <w:tab w:val="num" w:pos="2880"/>
+        </w:tabs>
+        <w:ind w:left="2880" w:hanging="360"/>
+      </w:pPr>
+      <w:rPr>
+        <w:rFonts w:ascii="Wingdings" w:hAnsi="Wingdings" w:hint="default"/>
+        <w:sz w:val="20"/>
+      </w:rPr>
+    </w:lvl>
+    <w:lvl w:ilvl="4" w:tentative="1">
+      <w:start w:val="1"/>
+      <w:numFmt w:val="bullet"/>
+      <w:lvlText w:val=""/>
+      <w:lvlJc w:val="left"/>
+      <w:pPr>
+        <w:tabs>
+          <w:tab w:val="num" w:pos="3600"/>
+        </w:tabs>
+        <w:ind w:left="3600" w:hanging="360"/>
+      </w:pPr>
+      <w:rPr>
+        <w:rFonts w:ascii="Wingdings" w:hAnsi="Wingdings" w:hint="default"/>
+        <w:sz w:val="20"/>
+      </w:rPr>
+    </w:lvl>
+    <w:lvl w:ilvl="5" w:tentative="1">
+      <w:start w:val="1"/>
+      <w:numFmt w:val="bullet"/>
+      <w:lvlText w:val=""/>
+      <w:lvlJc w:val="left"/>
+      <w:pPr>
+        <w:tabs>
+          <w:tab w:val="num" w:pos="4320"/>
+        </w:tabs>
+        <w:ind w:left="4320" w:hanging="360"/>
+      </w:pPr>
+      <w:rPr>
+        <w:rFonts w:ascii="Wingdings" w:hAnsi="Wingdings" w:hint="default"/>
+        <w:sz w:val="20"/>
+      </w:rPr>
+    </w:lvl>
+    <w:lvl w:ilvl="6" w:tentative="1">
+      <w:start w:val="1"/>
+      <w:numFmt w:val="bullet"/>
+      <w:lvlText w:val=""/>
+      <w:lvlJc w:val="left"/>
+      <w:pPr>
+        <w:tabs>
+          <w:tab w:val="num" w:pos="5040"/>
+        </w:tabs>
+        <w:ind w:left="5040" w:hanging="360"/>
+      </w:pPr>
+      <w:rPr>
+        <w:rFonts w:ascii="Wingdings" w:hAnsi="Wingdings" w:hint="default"/>
+        <w:sz w:val="20"/>
+      </w:rPr>
+    </w:lvl>
+    <w:lvl w:ilvl="7" w:tentative="1">
+      <w:start w:val="1"/>
+      <w:numFmt w:val="bullet"/>
+      <w:lvlText w:val=""/>
+      <w:lvlJc w:val="left"/>
+      <w:pPr>
+        <w:tabs>
+          <w:tab w:val="num" w:pos="5760"/>
+        </w:tabs>
+        <w:ind w:left="5760" w:hanging="360"/>
+      </w:pPr>
+      <w:rPr>
+        <w:rFonts w:ascii="Wingdings" w:hAnsi="Wingdings" w:hint="default"/>
+        <w:sz w:val="20"/>
+      </w:rPr>
+    </w:lvl>
+    <w:lvl w:ilvl="8" w:tentative="1">
+      <w:start w:val="1"/>
+      <w:numFmt w:val="bullet"/>
+      <w:lvlText w:val=""/>
+      <w:lvlJc w:val="left"/>
+      <w:pPr>
+        <w:tabs>
+          <w:tab w:val="num" w:pos="6480"/>
+        </w:tabs>
+        <w:ind w:left="6480" w:hanging="360"/>
+      </w:pPr>
+      <w:rPr>
+        <w:rFonts w:ascii="Wingdings" w:hAnsi="Wingdings" w:hint="default"/>
+        <w:sz w:val="20"/>
+      </w:rPr>
+    </w:lvl>
+  </w:abstractNum>
+  <w:abstractNum w:abstractNumId="2" w15:restartNumberingAfterBreak="0">
     <w:nsid w:val="206D1A5E"/>
     <w:multiLevelType w:val="multilevel"/>
     <w:tmpl w:val="6AC0B8D2"/>
@@ -1044,7 +1612,7 @@
       </w:rPr>
     </w:lvl>
   </w:abstractNum>
-  <w:abstractNum w:abstractNumId="2" w15:restartNumberingAfterBreak="0">
+  <w:abstractNum w:abstractNumId="3" w15:restartNumberingAfterBreak="0">
     <w:nsid w:val="2CE101F3"/>
     <w:multiLevelType w:val="multilevel"/>
     <w:tmpl w:val="C85AAAE2"/>
@@ -1193,7 +1761,273 @@
       </w:rPr>
     </w:lvl>
   </w:abstractNum>
-  <w:abstractNum w:abstractNumId="3" w15:restartNumberingAfterBreak="0">
+  <w:abstractNum w:abstractNumId="4" w15:restartNumberingAfterBreak="0">
+    <w:nsid w:val="35386EFE"/>
+    <w:multiLevelType w:val="multilevel"/>
+    <w:tmpl w:val="A1A845F8"/>
+    <w:lvl w:ilvl="0">
+      <w:start w:val="1"/>
+      <w:numFmt w:val="decimal"/>
+      <w:lvlText w:val="%1."/>
+      <w:lvlJc w:val="left"/>
+      <w:pPr>
+        <w:tabs>
+          <w:tab w:val="num" w:pos="720"/>
+        </w:tabs>
+        <w:ind w:left="720" w:hanging="360"/>
+      </w:pPr>
+    </w:lvl>
+    <w:lvl w:ilvl="1">
+      <w:start w:val="1"/>
+      <w:numFmt w:val="bullet"/>
+      <w:lvlText w:val="o"/>
+      <w:lvlJc w:val="left"/>
+      <w:pPr>
+        <w:tabs>
+          <w:tab w:val="num" w:pos="1440"/>
+        </w:tabs>
+        <w:ind w:left="1440" w:hanging="360"/>
+      </w:pPr>
+      <w:rPr>
+        <w:rFonts w:ascii="Courier New" w:hAnsi="Courier New" w:hint="default"/>
+        <w:sz w:val="20"/>
+      </w:rPr>
+    </w:lvl>
+    <w:lvl w:ilvl="2" w:tentative="1">
+      <w:start w:val="1"/>
+      <w:numFmt w:val="decimal"/>
+      <w:lvlText w:val="%3."/>
+      <w:lvlJc w:val="left"/>
+      <w:pPr>
+        <w:tabs>
+          <w:tab w:val="num" w:pos="2160"/>
+        </w:tabs>
+        <w:ind w:left="2160" w:hanging="360"/>
+      </w:pPr>
+    </w:lvl>
+    <w:lvl w:ilvl="3" w:tentative="1">
+      <w:start w:val="1"/>
+      <w:numFmt w:val="decimal"/>
+      <w:lvlText w:val="%4."/>
+      <w:lvlJc w:val="left"/>
+      <w:pPr>
+        <w:tabs>
+          <w:tab w:val="num" w:pos="2880"/>
+        </w:tabs>
+        <w:ind w:left="2880" w:hanging="360"/>
+      </w:pPr>
+    </w:lvl>
+    <w:lvl w:ilvl="4" w:tentative="1">
+      <w:start w:val="1"/>
+      <w:numFmt w:val="decimal"/>
+      <w:lvlText w:val="%5."/>
+      <w:lvlJc w:val="left"/>
+      <w:pPr>
+        <w:tabs>
+          <w:tab w:val="num" w:pos="3600"/>
+        </w:tabs>
+        <w:ind w:left="3600" w:hanging="360"/>
+      </w:pPr>
+    </w:lvl>
+    <w:lvl w:ilvl="5" w:tentative="1">
+      <w:start w:val="1"/>
+      <w:numFmt w:val="decimal"/>
+      <w:lvlText w:val="%6."/>
+      <w:lvlJc w:val="left"/>
+      <w:pPr>
+        <w:tabs>
+          <w:tab w:val="num" w:pos="4320"/>
+        </w:tabs>
+        <w:ind w:left="4320" w:hanging="360"/>
+      </w:pPr>
+    </w:lvl>
+    <w:lvl w:ilvl="6" w:tentative="1">
+      <w:start w:val="1"/>
+      <w:numFmt w:val="decimal"/>
+      <w:lvlText w:val="%7."/>
+      <w:lvlJc w:val="left"/>
+      <w:pPr>
+        <w:tabs>
+          <w:tab w:val="num" w:pos="5040"/>
+        </w:tabs>
+        <w:ind w:left="5040" w:hanging="360"/>
+      </w:pPr>
+    </w:lvl>
+    <w:lvl w:ilvl="7" w:tentative="1">
+      <w:start w:val="1"/>
+      <w:numFmt w:val="decimal"/>
+      <w:lvlText w:val="%8."/>
+      <w:lvlJc w:val="left"/>
+      <w:pPr>
+        <w:tabs>
+          <w:tab w:val="num" w:pos="5760"/>
+        </w:tabs>
+        <w:ind w:left="5760" w:hanging="360"/>
+      </w:pPr>
+    </w:lvl>
+    <w:lvl w:ilvl="8" w:tentative="1">
+      <w:start w:val="1"/>
+      <w:numFmt w:val="decimal"/>
+      <w:lvlText w:val="%9."/>
+      <w:lvlJc w:val="left"/>
+      <w:pPr>
+        <w:tabs>
+          <w:tab w:val="num" w:pos="6480"/>
+        </w:tabs>
+        <w:ind w:left="6480" w:hanging="360"/>
+      </w:pPr>
+    </w:lvl>
+  </w:abstractNum>
+  <w:abstractNum w:abstractNumId="5" w15:restartNumberingAfterBreak="0">
+    <w:nsid w:val="37404969"/>
+    <w:multiLevelType w:val="multilevel"/>
+    <w:tmpl w:val="18FCEF36"/>
+    <w:lvl w:ilvl="0">
+      <w:start w:val="1"/>
+      <w:numFmt w:val="bullet"/>
+      <w:lvlText w:val=""/>
+      <w:lvlJc w:val="left"/>
+      <w:pPr>
+        <w:tabs>
+          <w:tab w:val="num" w:pos="720"/>
+        </w:tabs>
+        <w:ind w:left="720" w:hanging="360"/>
+      </w:pPr>
+      <w:rPr>
+        <w:rFonts w:ascii="Symbol" w:hAnsi="Symbol" w:hint="default"/>
+        <w:sz w:val="20"/>
+      </w:rPr>
+    </w:lvl>
+    <w:lvl w:ilvl="1" w:tentative="1">
+      <w:start w:val="1"/>
+      <w:numFmt w:val="bullet"/>
+      <w:lvlText w:val="o"/>
+      <w:lvlJc w:val="left"/>
+      <w:pPr>
+        <w:tabs>
+          <w:tab w:val="num" w:pos="1440"/>
+        </w:tabs>
+        <w:ind w:left="1440" w:hanging="360"/>
+      </w:pPr>
+      <w:rPr>
+        <w:rFonts w:ascii="Courier New" w:hAnsi="Courier New" w:hint="default"/>
+        <w:sz w:val="20"/>
+      </w:rPr>
+    </w:lvl>
+    <w:lvl w:ilvl="2" w:tentative="1">
+      <w:start w:val="1"/>
+      <w:numFmt w:val="bullet"/>
+      <w:lvlText w:val=""/>
+      <w:lvlJc w:val="left"/>
+      <w:pPr>
+        <w:tabs>
+          <w:tab w:val="num" w:pos="2160"/>
+        </w:tabs>
+        <w:ind w:left="2160" w:hanging="360"/>
+      </w:pPr>
+      <w:rPr>
+        <w:rFonts w:ascii="Wingdings" w:hAnsi="Wingdings" w:hint="default"/>
+        <w:sz w:val="20"/>
+      </w:rPr>
+    </w:lvl>
+    <w:lvl w:ilvl="3" w:tentative="1">
+      <w:start w:val="1"/>
+      <w:numFmt w:val="bullet"/>
+      <w:lvlText w:val=""/>
+      <w:lvlJc w:val="left"/>
+      <w:pPr>
+        <w:tabs>
+          <w:tab w:val="num" w:pos="2880"/>
+        </w:tabs>
+        <w:ind w:left="2880" w:hanging="360"/>
+      </w:pPr>
+      <w:rPr>
+        <w:rFonts w:ascii="Wingdings" w:hAnsi="Wingdings" w:hint="default"/>
+        <w:sz w:val="20"/>
+      </w:rPr>
+    </w:lvl>
+    <w:lvl w:ilvl="4" w:tentative="1">
+      <w:start w:val="1"/>
+      <w:numFmt w:val="bullet"/>
+      <w:lvlText w:val=""/>
+      <w:lvlJc w:val="left"/>
+      <w:pPr>
+        <w:tabs>
+          <w:tab w:val="num" w:pos="3600"/>
+        </w:tabs>
+        <w:ind w:left="3600" w:hanging="360"/>
+      </w:pPr>
+      <w:rPr>
+        <w:rFonts w:ascii="Wingdings" w:hAnsi="Wingdings" w:hint="default"/>
+        <w:sz w:val="20"/>
+      </w:rPr>
+    </w:lvl>
+    <w:lvl w:ilvl="5" w:tentative="1">
+      <w:start w:val="1"/>
+      <w:numFmt w:val="bullet"/>
+      <w:lvlText w:val=""/>
+      <w:lvlJc w:val="left"/>
+      <w:pPr>
+        <w:tabs>
+          <w:tab w:val="num" w:pos="4320"/>
+        </w:tabs>
+        <w:ind w:left="4320" w:hanging="360"/>
+      </w:pPr>
+      <w:rPr>
+        <w:rFonts w:ascii="Wingdings" w:hAnsi="Wingdings" w:hint="default"/>
+        <w:sz w:val="20"/>
+      </w:rPr>
+    </w:lvl>
+    <w:lvl w:ilvl="6" w:tentative="1">
+      <w:start w:val="1"/>
+      <w:numFmt w:val="bullet"/>
+      <w:lvlText w:val=""/>
+      <w:lvlJc w:val="left"/>
+      <w:pPr>
+        <w:tabs>
+          <w:tab w:val="num" w:pos="5040"/>
+        </w:tabs>
+        <w:ind w:left="5040" w:hanging="360"/>
+      </w:pPr>
+      <w:rPr>
+        <w:rFonts w:ascii="Wingdings" w:hAnsi="Wingdings" w:hint="default"/>
+        <w:sz w:val="20"/>
+      </w:rPr>
+    </w:lvl>
+    <w:lvl w:ilvl="7" w:tentative="1">
+      <w:start w:val="1"/>
+      <w:numFmt w:val="bullet"/>
+      <w:lvlText w:val=""/>
+      <w:lvlJc w:val="left"/>
+      <w:pPr>
+        <w:tabs>
+          <w:tab w:val="num" w:pos="5760"/>
+        </w:tabs>
+        <w:ind w:left="5760" w:hanging="360"/>
+      </w:pPr>
+      <w:rPr>
+        <w:rFonts w:ascii="Wingdings" w:hAnsi="Wingdings" w:hint="default"/>
+        <w:sz w:val="20"/>
+      </w:rPr>
+    </w:lvl>
+    <w:lvl w:ilvl="8" w:tentative="1">
+      <w:start w:val="1"/>
+      <w:numFmt w:val="bullet"/>
+      <w:lvlText w:val=""/>
+      <w:lvlJc w:val="left"/>
+      <w:pPr>
+        <w:tabs>
+          <w:tab w:val="num" w:pos="6480"/>
+        </w:tabs>
+        <w:ind w:left="6480" w:hanging="360"/>
+      </w:pPr>
+      <w:rPr>
+        <w:rFonts w:ascii="Wingdings" w:hAnsi="Wingdings" w:hint="default"/>
+        <w:sz w:val="20"/>
+      </w:rPr>
+    </w:lvl>
+  </w:abstractNum>
+  <w:abstractNum w:abstractNumId="6" w15:restartNumberingAfterBreak="0">
     <w:nsid w:val="44117E4F"/>
     <w:multiLevelType w:val="multilevel"/>
     <w:tmpl w:val="F5EABF06"/>
@@ -1342,7 +2176,7 @@
       </w:rPr>
     </w:lvl>
   </w:abstractNum>
-  <w:abstractNum w:abstractNumId="4" w15:restartNumberingAfterBreak="0">
+  <w:abstractNum w:abstractNumId="7" w15:restartNumberingAfterBreak="0">
     <w:nsid w:val="49143DC7"/>
     <w:multiLevelType w:val="multilevel"/>
     <w:tmpl w:val="9910698E"/>
@@ -1491,7 +2325,7 @@
       </w:rPr>
     </w:lvl>
   </w:abstractNum>
-  <w:abstractNum w:abstractNumId="5" w15:restartNumberingAfterBreak="0">
+  <w:abstractNum w:abstractNumId="8" w15:restartNumberingAfterBreak="0">
     <w:nsid w:val="4BC5062C"/>
     <w:multiLevelType w:val="multilevel"/>
     <w:tmpl w:val="FA068072"/>
@@ -1604,7 +2438,156 @@
       </w:pPr>
     </w:lvl>
   </w:abstractNum>
-  <w:abstractNum w:abstractNumId="6" w15:restartNumberingAfterBreak="0">
+  <w:abstractNum w:abstractNumId="9" w15:restartNumberingAfterBreak="0">
+    <w:nsid w:val="61652015"/>
+    <w:multiLevelType w:val="multilevel"/>
+    <w:tmpl w:val="DF0AFE3A"/>
+    <w:lvl w:ilvl="0">
+      <w:start w:val="1"/>
+      <w:numFmt w:val="bullet"/>
+      <w:lvlText w:val=""/>
+      <w:lvlJc w:val="left"/>
+      <w:pPr>
+        <w:tabs>
+          <w:tab w:val="num" w:pos="720"/>
+        </w:tabs>
+        <w:ind w:left="720" w:hanging="360"/>
+      </w:pPr>
+      <w:rPr>
+        <w:rFonts w:ascii="Symbol" w:hAnsi="Symbol" w:hint="default"/>
+        <w:sz w:val="20"/>
+      </w:rPr>
+    </w:lvl>
+    <w:lvl w:ilvl="1" w:tentative="1">
+      <w:start w:val="1"/>
+      <w:numFmt w:val="bullet"/>
+      <w:lvlText w:val="o"/>
+      <w:lvlJc w:val="left"/>
+      <w:pPr>
+        <w:tabs>
+          <w:tab w:val="num" w:pos="1440"/>
+        </w:tabs>
+        <w:ind w:left="1440" w:hanging="360"/>
+      </w:pPr>
+      <w:rPr>
+        <w:rFonts w:ascii="Courier New" w:hAnsi="Courier New" w:hint="default"/>
+        <w:sz w:val="20"/>
+      </w:rPr>
+    </w:lvl>
+    <w:lvl w:ilvl="2" w:tentative="1">
+      <w:start w:val="1"/>
+      <w:numFmt w:val="bullet"/>
+      <w:lvlText w:val=""/>
+      <w:lvlJc w:val="left"/>
+      <w:pPr>
+        <w:tabs>
+          <w:tab w:val="num" w:pos="2160"/>
+        </w:tabs>
+        <w:ind w:left="2160" w:hanging="360"/>
+      </w:pPr>
+      <w:rPr>
+        <w:rFonts w:ascii="Wingdings" w:hAnsi="Wingdings" w:hint="default"/>
+        <w:sz w:val="20"/>
+      </w:rPr>
+    </w:lvl>
+    <w:lvl w:ilvl="3" w:tentative="1">
+      <w:start w:val="1"/>
+      <w:numFmt w:val="bullet"/>
+      <w:lvlText w:val=""/>
+      <w:lvlJc w:val="left"/>
+      <w:pPr>
+        <w:tabs>
+          <w:tab w:val="num" w:pos="2880"/>
+        </w:tabs>
+        <w:ind w:left="2880" w:hanging="360"/>
+      </w:pPr>
+      <w:rPr>
+        <w:rFonts w:ascii="Wingdings" w:hAnsi="Wingdings" w:hint="default"/>
+        <w:sz w:val="20"/>
+      </w:rPr>
+    </w:lvl>
+    <w:lvl w:ilvl="4" w:tentative="1">
+      <w:start w:val="1"/>
+      <w:numFmt w:val="bullet"/>
+      <w:lvlText w:val=""/>
+      <w:lvlJc w:val="left"/>
+      <w:pPr>
+        <w:tabs>
+          <w:tab w:val="num" w:pos="3600"/>
+        </w:tabs>
+        <w:ind w:left="3600" w:hanging="360"/>
+      </w:pPr>
+      <w:rPr>
+        <w:rFonts w:ascii="Wingdings" w:hAnsi="Wingdings" w:hint="default"/>
+        <w:sz w:val="20"/>
+      </w:rPr>
+    </w:lvl>
+    <w:lvl w:ilvl="5" w:tentative="1">
+      <w:start w:val="1"/>
+      <w:numFmt w:val="bullet"/>
+      <w:lvlText w:val=""/>
+      <w:lvlJc w:val="left"/>
+      <w:pPr>
+        <w:tabs>
+          <w:tab w:val="num" w:pos="4320"/>
+        </w:tabs>
+        <w:ind w:left="4320" w:hanging="360"/>
+      </w:pPr>
+      <w:rPr>
+        <w:rFonts w:ascii="Wingdings" w:hAnsi="Wingdings" w:hint="default"/>
+        <w:sz w:val="20"/>
+      </w:rPr>
+    </w:lvl>
+    <w:lvl w:ilvl="6" w:tentative="1">
+      <w:start w:val="1"/>
+      <w:numFmt w:val="bullet"/>
+      <w:lvlText w:val=""/>
+      <w:lvlJc w:val="left"/>
+      <w:pPr>
+        <w:tabs>
+          <w:tab w:val="num" w:pos="5040"/>
+        </w:tabs>
+        <w:ind w:left="5040" w:hanging="360"/>
+      </w:pPr>
+      <w:rPr>
+        <w:rFonts w:ascii="Wingdings" w:hAnsi="Wingdings" w:hint="default"/>
+        <w:sz w:val="20"/>
+      </w:rPr>
+    </w:lvl>
+    <w:lvl w:ilvl="7" w:tentative="1">
+      <w:start w:val="1"/>
+      <w:numFmt w:val="bullet"/>
+      <w:lvlText w:val=""/>
+      <w:lvlJc w:val="left"/>
+      <w:pPr>
+        <w:tabs>
+          <w:tab w:val="num" w:pos="5760"/>
+        </w:tabs>
+        <w:ind w:left="5760" w:hanging="360"/>
+      </w:pPr>
+      <w:rPr>
+        <w:rFonts w:ascii="Wingdings" w:hAnsi="Wingdings" w:hint="default"/>
+        <w:sz w:val="20"/>
+      </w:rPr>
+    </w:lvl>
+    <w:lvl w:ilvl="8" w:tentative="1">
+      <w:start w:val="1"/>
+      <w:numFmt w:val="bullet"/>
+      <w:lvlText w:val=""/>
+      <w:lvlJc w:val="left"/>
+      <w:pPr>
+        <w:tabs>
+          <w:tab w:val="num" w:pos="6480"/>
+        </w:tabs>
+        <w:ind w:left="6480" w:hanging="360"/>
+      </w:pPr>
+      <w:rPr>
+        <w:rFonts w:ascii="Wingdings" w:hAnsi="Wingdings" w:hint="default"/>
+        <w:sz w:val="20"/>
+      </w:rPr>
+    </w:lvl>
+  </w:abstractNum>
+  <w:abstractNum w:abstractNumId="10" w15:restartNumberingAfterBreak="0">
     <w:nsid w:val="67671D59"/>
     <w:multiLevelType w:val="multilevel"/>
     <w:tmpl w:val="464C2B94"/>
@@ -1753,7 +2736,7 @@
       </w:rPr>
     </w:lvl>
   </w:abstractNum>
-  <w:abstractNum w:abstractNumId="7" w15:restartNumberingAfterBreak="0">
+  <w:abstractNum w:abstractNumId="11" w15:restartNumberingAfterBreak="0">
     <w:nsid w:val="78B9186B"/>
     <w:multiLevelType w:val="multilevel"/>
     <w:tmpl w:val="097678A0"/>
@@ -1903,28 +2886,40 @@
     </w:lvl>
   </w:abstractNum>
   <w:num w:numId="1" w16cid:durableId="200938893">
-    <w:abstractNumId w:val="5"/>
+    <w:abstractNumId w:val="8"/>
   </w:num>
   <w:num w:numId="2" w16cid:durableId="551035972">
-    <w:abstractNumId w:val="6"/>
+    <w:abstractNumId w:val="10"/>
   </w:num>
   <w:num w:numId="3" w16cid:durableId="92215113">
-    <w:abstractNumId w:val="7"/>
+    <w:abstractNumId w:val="11"/>
   </w:num>
   <w:num w:numId="4" w16cid:durableId="1781682439">
     <w:abstractNumId w:val="0"/>
   </w:num>
   <w:num w:numId="5" w16cid:durableId="560289244">
+    <w:abstractNumId w:val="3"/>
+  </w:num>
+  <w:num w:numId="6" w16cid:durableId="1838492272">
     <w:abstractNumId w:val="2"/>
   </w:num>
-  <w:num w:numId="6" w16cid:durableId="1838492272">
+  <w:num w:numId="7" w16cid:durableId="74207348">
+    <w:abstractNumId w:val="7"/>
+  </w:num>
+  <w:num w:numId="8" w16cid:durableId="1993485081">
+    <w:abstractNumId w:val="6"/>
+  </w:num>
+  <w:num w:numId="9" w16cid:durableId="2001536201">
     <w:abstractNumId w:val="1"/>
   </w:num>
-  <w:num w:numId="7" w16cid:durableId="74207348">
+  <w:num w:numId="10" w16cid:durableId="1414664842">
+    <w:abstractNumId w:val="5"/>
+  </w:num>
+  <w:num w:numId="11" w16cid:durableId="1259484120">
+    <w:abstractNumId w:val="9"/>
+  </w:num>
+  <w:num w:numId="12" w16cid:durableId="1186359114">
     <w:abstractNumId w:val="4"/>
-  </w:num>
-  <w:num w:numId="8" w16cid:durableId="1993485081">
-    <w:abstractNumId w:val="3"/>
   </w:num>
 </w:numbering>
 </file>

</xml_diff>